<commit_message>
MPD-1: Update release tag in Word documentation
</commit_message>
<xml_diff>
--- a/docs/project-documentation.docx
+++ b/docs/project-documentation.docx
@@ -460,15 +460,11 @@
             <w:pPr>
               <w:spacing w:after="30"/>
             </w:pPr>
-            <w:r>
-              <w:rPr>
-                <w:sz w:val="20"/>
-                <w:szCs w:val="20"/>
-              </w:rPr>
-              <w:t>pre-defense-1</w:t>
-            </w:r>
             <w:bookmarkStart w:id="0" w:name="_GoBack"/>
             <w:bookmarkEnd w:id="0"/>
+            <w:r>
+              <w:t>prob-period-1</w:t>
+            </w:r>
           </w:p>
         </w:tc>
       </w:tr>

</xml_diff>

<commit_message>
MPD-1: Update Word documentation to match Markdown version
</commit_message>
<xml_diff>
--- a/docs/project-documentation.docx
+++ b/docs/project-documentation.docx
@@ -11,8 +11,6 @@
       <w:pPr>
         <w:spacing w:after="300"/>
         <w:jc w:val="center"/>
-      </w:pPr>
-      <w:r>
         <w:rPr>
           <w:b/>
           <w:bCs/>
@@ -20,7 +18,36 @@
           <w:sz w:val="24"/>
           <w:szCs w:val="24"/>
         </w:rPr>
-        <w:t>PRE-DEFENSE  — PROJECT DOCUMENTATION</w:t>
+      </w:pPr>
+      <w:r>
+        <w:rPr>
+          <w:b/>
+          <w:bCs/>
+          <w:color w:val="2F5597"/>
+          <w:sz w:val="24"/>
+          <w:szCs w:val="24"/>
+        </w:rPr>
+        <w:t>Prob-P</w:t>
+      </w:r>
+      <w:r>
+        <w:rPr>
+          <w:b/>
+          <w:bCs/>
+          <w:color w:val="2F5597"/>
+          <w:sz w:val="24"/>
+          <w:szCs w:val="24"/>
+        </w:rPr>
+        <w:t>eriod-1</w:t>
+      </w:r>
+      <w:r>
+        <w:rPr>
+          <w:b/>
+          <w:bCs/>
+          <w:color w:val="2F5597"/>
+          <w:sz w:val="24"/>
+          <w:szCs w:val="24"/>
+        </w:rPr>
+        <w:t>— PROJECT DOCUMENTATION</w:t>
       </w:r>
     </w:p>
     <w:p>
@@ -35,7 +62,18 @@
           <w:sz w:val="44"/>
           <w:szCs w:val="44"/>
         </w:rPr>
-        <w:t>Multilingual Phishing Detection System for Kazakh, Russian and English Using Large Language Models</w:t>
+        <w:t>Multilingual Phishing De</w:t>
+      </w:r>
+      <w:bookmarkStart w:id="0" w:name="_GoBack"/>
+      <w:bookmarkEnd w:id="0"/>
+      <w:r>
+        <w:rPr>
+          <w:b/>
+          <w:bCs/>
+          <w:sz w:val="44"/>
+          <w:szCs w:val="44"/>
+        </w:rPr>
+        <w:t>tection System for Kazakh, Russian and English Using Large Language Models</w:t>
       </w:r>
     </w:p>
     <w:p>
@@ -460,8 +498,6 @@
             <w:pPr>
               <w:spacing w:after="30"/>
             </w:pPr>
-            <w:bookmarkStart w:id="0" w:name="_GoBack"/>
-            <w:bookmarkEnd w:id="0"/>
             <w:r>
               <w:t>prob-period-1</w:t>
             </w:r>
@@ -18216,7 +18252,6 @@
   <w:style w:type="character" w:default="1" w:styleId="a0">
     <w:name w:val="Default Paragraph Font"/>
     <w:uiPriority w:val="1"/>
-    <w:semiHidden/>
     <w:unhideWhenUsed/>
   </w:style>
   <w:style w:type="table" w:default="1" w:styleId="a1">

</xml_diff>